<commit_message>
Add explicit CTO/Head of Product/Finance sign-off section to Master Handover
</commit_message>
<xml_diff>
--- a/ReaderBull_Master_Handover.docx
+++ b/ReaderBull_Master_Handover.docx
@@ -2,7 +2,7 @@
 <file path=word/document.xml><?xml version="1.0" encoding="utf-8"?>
 <w:document xmlns:w="http://schemas.openxmlformats.org/wordprocessingml/2006/main" xmlns:m="http://schemas.openxmlformats.org/officeDocument/2006/math" xmlns:r="http://schemas.openxmlformats.org/officeDocument/2006/relationships" xmlns:o="urn:schemas-microsoft-com:office:office" xmlns:v="urn:schemas-microsoft-com:vml" xmlns:w10="urn:schemas-microsoft-com:office:word" xmlns:a="http://schemas.openxmlformats.org/drawingml/2006/main" xmlns:pic="http://schemas.openxmlformats.org/drawingml/2006/picture" xmlns:wp="http://schemas.openxmlformats.org/drawingml/2006/wordprocessingDrawing">
   <w:body>
-    <w:bookmarkStart w:id="46" w:name="readerbull-platform-master-handover"/>
+    <w:bookmarkStart w:id="47" w:name="readerbull-platform-master-handover"/>
     <w:p>
       <w:pPr>
         <w:pStyle w:val="Heading1"/>
@@ -2439,7 +2439,7 @@
       </w:r>
     </w:p>
     <w:bookmarkEnd w:id="33"/>
-    <w:bookmarkStart w:id="37" w:name="X87b2a20a54abaa998c6f7a2f49d32490fcea615"/>
+    <w:bookmarkStart w:id="38" w:name="X87b2a20a54abaa998c6f7a2f49d32490fcea615"/>
     <w:p>
       <w:pPr>
         <w:pStyle w:val="Heading2"/>
@@ -2589,15 +2589,14 @@
       <w:r>
         <w:t xml:space="preserve">— fixed with explanatory subtext on the Best Seller Rank card distinguishing category rank (what this dashboard shows) from Amazon’s store-wide rank (what the listing page shows).</w:t>
       </w:r>
-      <w:r>
-        <w:t xml:space="preserve"> </w:t>
-      </w:r>
-      <w:r>
-        <w:t xml:space="preserve">4 &amp; 5.</w:t>
-      </w:r>
-      <w:r>
-        <w:t xml:space="preserve"> </w:t>
-      </w:r>
+    </w:p>
+    <w:p>
+      <w:pPr>
+        <w:numPr>
+          <w:ilvl w:val="0"/>
+          <w:numId w:val="1006"/>
+        </w:numPr>
+      </w:pPr>
       <w:r>
         <w:rPr>
           <w:bCs/>
@@ -2673,7 +2672,7 @@
           <w:bCs/>
           <w:b/>
         </w:rPr>
-        <w:t xml:space="preserve">tiles, unclear meaning</w:t>
+        <w:t xml:space="preserve">tiles, unclear meaning (this covers both item 4 and item 5 from the original 8)</w:t>
       </w:r>
       <w:r>
         <w:t xml:space="preserve"> </w:t>
@@ -3239,31 +3238,22 @@
         <w:t xml:space="preserve">rate limiting is untouched and still enforced before any paid call. Flagged that the Book Insight system prompt is now roughly 12,270 characters (~3,050 tokens), a real, meaningful input-token cost increase per narrative call versus a short prompt — not a problem at current volume, but worth being aware of if audit volume grows a lot.</w:t>
       </w:r>
     </w:p>
-    <w:p>
-      <w:r>
-        <w:pict>
-          <v:rect style="width:0;height:1.5pt" o:hralign="center" o:hrstd="t" o:hr="t"/>
-        </w:pict>
-      </w:r>
-    </w:p>
     <w:bookmarkEnd w:id="36"/>
-    <w:bookmarkEnd w:id="37"/>
-    <w:bookmarkStart w:id="40" w:name="Xaa4c2cf9281dfcefa6f8925d41dca30e7f73d65"/>
-    <w:p>
-      <w:pPr>
-        <w:pStyle w:val="Heading2"/>
-      </w:pPr>
-      <w:r>
-        <w:t xml:space="preserve">7. Known issues, technical debt, and things worth trusting carefully</w:t>
-      </w:r>
-    </w:p>
-    <w:bookmarkStart w:id="38" w:name="still-open-carried-over-or-new"/>
+    <w:bookmarkStart w:id="37" w:name="sign-off"/>
     <w:p>
       <w:pPr>
         <w:pStyle w:val="Heading3"/>
       </w:pPr>
       <w:r>
-        <w:t xml:space="preserve">7.1 Still open, carried over or new</w:t>
+        <w:t xml:space="preserve">6.4 Sign-off</w:t>
+      </w:r>
+    </w:p>
+    <w:p>
+      <w:pPr>
+        <w:pStyle w:val="FirstParagraph"/>
+      </w:pPr>
+      <w:r>
+        <w:t xml:space="preserve">ReaderBull is a solo-founder operation — there is no separate CTO, Head of Product, or Finance function distinct from John Hones and this Claude session. The three passes in Section 6.3 were run as independent, adversarial reviews of the live production code from those three professional perspectives, each done by a fresh reviewer with no access to the implementer’s own account of the work, checking the actual live files rather than trusting a self-report. Their verdicts:</w:t>
       </w:r>
     </w:p>
     <w:p>
@@ -3275,7 +3265,47 @@
         <w:pStyle w:val="Compact"/>
       </w:pPr>
       <w:r>
-        <w:t xml:space="preserve">Review system (Get Reviews / Build Your ARC) — still a placeholder, per the 12 August handover’s priority list, not started this session.</w:t>
+        <w:rPr>
+          <w:bCs/>
+          <w:b/>
+        </w:rPr>
+        <w:t xml:space="preserve">CTO / technical sign-off — APPROVED.</w:t>
+      </w:r>
+      <w:r>
+        <w:t xml:space="preserve"> </w:t>
+      </w:r>
+      <w:r>
+        <w:t xml:space="preserve">No blocking issues. Syntax valid, both old and new data shapes render safely,</w:t>
+      </w:r>
+      <w:r>
+        <w:t xml:space="preserve"> </w:t>
+      </w:r>
+      <w:r>
+        <w:rPr>
+          <w:rStyle w:val="VerbatimChar"/>
+        </w:rPr>
+        <w:t xml:space="preserve">amazonAdsActive</w:t>
+      </w:r>
+      <w:r>
+        <w:t xml:space="preserve"> </w:t>
+      </w:r>
+      <w:r>
+        <w:t xml:space="preserve">threading confirmed end-to-end, no debug leftovers, the</w:t>
+      </w:r>
+      <w:r>
+        <w:t xml:space="preserve"> </w:t>
+      </w:r>
+      <w:r>
+        <w:rPr>
+          <w:rStyle w:val="VerbatimChar"/>
+        </w:rPr>
+        <w:t xml:space="preserve">Promise.all</w:t>
+      </w:r>
+      <w:r>
+        <w:t xml:space="preserve"> </w:t>
+      </w:r>
+      <w:r>
+        <w:t xml:space="preserve">refactor confirmed independent (no hidden coupling). One cosmetic, currently-unreachable edge case noted, not a blocker.</w:t>
       </w:r>
     </w:p>
     <w:p>
@@ -3287,31 +3317,53 @@
         <w:pStyle w:val="Compact"/>
       </w:pPr>
       <w:r>
-        <w:t xml:space="preserve">Book portfolio feature — still built on</w:t>
-      </w:r>
-      <w:r>
-        <w:t xml:space="preserve"> </w:t>
-      </w:r>
-      <w:r>
-        <w:rPr>
-          <w:rStyle w:val="VerbatimChar"/>
-        </w:rPr>
-        <w:t xml:space="preserve">staging</w:t>
-      </w:r>
-      <w:r>
-        <w:t xml:space="preserve">, not merged to</w:t>
-      </w:r>
-      <w:r>
-        <w:t xml:space="preserve"> </w:t>
-      </w:r>
-      <w:r>
-        <w:rPr>
-          <w:rStyle w:val="VerbatimChar"/>
-        </w:rPr>
-        <w:t xml:space="preserve">main</w:t>
-      </w:r>
-      <w:r>
-        <w:t xml:space="preserve">, not touched this session.</w:t>
+        <w:rPr>
+          <w:bCs/>
+          <w:b/>
+        </w:rPr>
+        <w:t xml:space="preserve">Head of Product / copy sign-off — APPROVED, with two follow-ups.</w:t>
+      </w:r>
+      <w:r>
+        <w:t xml:space="preserve"> </w:t>
+      </w:r>
+      <w:r>
+        <w:t xml:space="preserve">All 8 original customer complaints and the full Book Insight rewrite spec independently verified against the live rendering code and prompt text, item by item (Section 6.1). Not a rubber stamp: two real gaps were surfaced and are logged as open items rather than swept in — the</w:t>
+      </w:r>
+      <w:r>
+        <w:t xml:space="preserve"> </w:t>
+      </w:r>
+      <w:r>
+        <w:t xml:space="preserve">“</w:t>
+      </w:r>
+      <w:r>
+        <w:t xml:space="preserve">Refresh audit</w:t>
+      </w:r>
+      <w:r>
+        <w:t xml:space="preserve">”</w:t>
+      </w:r>
+      <w:r>
+        <w:t xml:space="preserve"> </w:t>
+      </w:r>
+      <w:r>
+        <w:t xml:space="preserve">modal still doesn’t reassure authors it’s free (Section 7.1, item 7), and the</w:t>
+      </w:r>
+      <w:r>
+        <w:t xml:space="preserve"> </w:t>
+      </w:r>
+      <w:r>
+        <w:t xml:space="preserve">“</w:t>
+      </w:r>
+      <w:r>
+        <w:t xml:space="preserve">ACoS</w:t>
+      </w:r>
+      <w:r>
+        <w:t xml:space="preserve">”</w:t>
+      </w:r>
+      <w:r>
+        <w:t xml:space="preserve"> </w:t>
+      </w:r>
+      <w:r>
+        <w:t xml:space="preserve">jargon ban wasn’t extended beyond the Book Insight paragraph (Section 7.1, item 8). Sign-off is conditional on those being picked up, not on them being invisible.</w:t>
       </w:r>
     </w:p>
     <w:p>
@@ -3323,286 +3375,17 @@
         <w:pStyle w:val="Compact"/>
       </w:pPr>
       <w:r>
-        <w:t xml:space="preserve">No automated tests anywhere in this codebase.</w:t>
-      </w:r>
-    </w:p>
-    <w:p>
-      <w:pPr>
-        <w:numPr>
-          <w:ilvl w:val="0"/>
-          <w:numId w:val="1009"/>
-        </w:numPr>
-        <w:pStyle w:val="Compact"/>
-      </w:pPr>
-      <w:r>
-        <w:t xml:space="preserve">Mobile still not re-verified for anything, carried over from 12 August.</w:t>
-      </w:r>
-    </w:p>
-    <w:p>
-      <w:pPr>
-        <w:numPr>
-          <w:ilvl w:val="0"/>
-          <w:numId w:val="1009"/>
-        </w:numPr>
-        <w:pStyle w:val="Compact"/>
-      </w:pPr>
-      <w:r>
-        <w:t xml:space="preserve">No</w:t>
-      </w:r>
-      <w:r>
-        <w:t xml:space="preserve"> </w:t>
-      </w:r>
-      <w:r>
-        <w:rPr>
-          <w:rStyle w:val="VerbatimChar"/>
-        </w:rPr>
-        <w:t xml:space="preserve">git</w:t>
-      </w:r>
-      <w:r>
-        <w:t xml:space="preserve"> </w:t>
-      </w:r>
-      <w:r>
-        <w:t xml:space="preserve">CLI access this session (see Section 3.2) — re-verify at the start of the next session rather than assuming either way.</w:t>
-      </w:r>
-    </w:p>
-    <w:p>
-      <w:pPr>
-        <w:numPr>
-          <w:ilvl w:val="0"/>
-          <w:numId w:val="1009"/>
-        </w:numPr>
-        <w:pStyle w:val="Compact"/>
-      </w:pPr>
-      <w:r>
-        <w:rPr>
-          <w:rStyle w:val="VerbatimChar"/>
-        </w:rPr>
-        <w:t xml:space="preserve">raw.githubusercontent.com</w:t>
-      </w:r>
-      <w:r>
-        <w:t xml:space="preserve">’s ~5-minute CDN cache can make a fresh push look stale if fetched immediately — verify via GitHub’s commit UI instead.</w:t>
-      </w:r>
-    </w:p>
-    <w:p>
-      <w:pPr>
-        <w:numPr>
-          <w:ilvl w:val="0"/>
-          <w:numId w:val="1009"/>
-        </w:numPr>
-        <w:pStyle w:val="Compact"/>
-      </w:pPr>
-      <w:r>
-        <w:rPr>
-          <w:bCs/>
-          <w:b/>
-        </w:rPr>
-        <w:t xml:space="preserve">New, from this session’s review pass:</w:t>
-      </w:r>
-      <w:r>
-        <w:t xml:space="preserve"> </w:t>
-      </w:r>
-      <w:r>
-        <w:t xml:space="preserve">the</w:t>
-      </w:r>
-      <w:r>
-        <w:t xml:space="preserve"> </w:t>
-      </w:r>
-      <w:r>
-        <w:t xml:space="preserve">“</w:t>
-      </w:r>
-      <w:r>
-        <w:t xml:space="preserve">Refresh audit</w:t>
-      </w:r>
-      <w:r>
-        <w:t xml:space="preserve">”</w:t>
-      </w:r>
-      <w:r>
-        <w:t xml:space="preserve"> </w:t>
-      </w:r>
-      <w:r>
-        <w:t xml:space="preserve">modal never actually tells the author refreshing is free — it shows a cooldown and a timestamp, but no reassuring copy. The customer’s original worry (</w:t>
-      </w:r>
-      <w:r>
-        <w:t xml:space="preserve">“</w:t>
-      </w:r>
-      <w:r>
-        <w:t xml:space="preserve">does this cost anything?</w:t>
-      </w:r>
-      <w:r>
-        <w:t xml:space="preserve">”</w:t>
-      </w:r>
-      <w:r>
-        <w:t xml:space="preserve">) is only partially addressed. A one-line copy addition would close this.</w:t>
-      </w:r>
-    </w:p>
-    <w:p>
-      <w:pPr>
-        <w:numPr>
-          <w:ilvl w:val="0"/>
-          <w:numId w:val="1009"/>
-        </w:numPr>
-        <w:pStyle w:val="Compact"/>
-      </w:pPr>
-      <w:r>
-        <w:rPr>
-          <w:bCs/>
-          <w:b/>
-        </w:rPr>
-        <w:t xml:space="preserve">New, from this session’s review pass:</w:t>
-      </w:r>
-      <w:r>
-        <w:t xml:space="preserve"> </w:t>
-      </w:r>
-      <w:r>
-        <w:t xml:space="preserve">the</w:t>
-      </w:r>
-      <w:r>
-        <w:t xml:space="preserve"> </w:t>
-      </w:r>
-      <w:r>
-        <w:t xml:space="preserve">“</w:t>
-      </w:r>
-      <w:r>
-        <w:t xml:space="preserve">ACoS</w:t>
-      </w:r>
-      <w:r>
-        <w:t xml:space="preserve">”</w:t>
-      </w:r>
-      <w:r>
-        <w:t xml:space="preserve"> </w:t>
-      </w:r>
-      <w:r>
-        <w:t xml:space="preserve">jargon ban only applies to the Book Insight paragraph. The same term (</w:t>
-      </w:r>
-      <w:r>
-        <w:t xml:space="preserve">“</w:t>
-      </w:r>
-      <w:r>
-        <w:t xml:space="preserve">target ACoS ceiling</w:t>
-      </w:r>
-      <w:r>
-        <w:t xml:space="preserve">”</w:t>
-      </w:r>
-      <w:r>
-        <w:t xml:space="preserve">) still appears in the</w:t>
-      </w:r>
-      <w:r>
-        <w:t xml:space="preserve"> </w:t>
-      </w:r>
-      <w:r>
-        <w:rPr>
-          <w:rStyle w:val="VerbatimChar"/>
-        </w:rPr>
-        <w:t xml:space="preserve">strategySteps</w:t>
-      </w:r>
-      <w:r>
-        <w:t xml:space="preserve"> </w:t>
-      </w:r>
-      <w:r>
-        <w:t xml:space="preserve">prompt instructions (Marketing Strategy tab), so the same non-technical author can still hit this jargon elsewhere on the dashboard. Worth deciding whether to extend the ban dashboard-wide.</w:t>
-      </w:r>
-    </w:p>
-    <w:p>
-      <w:pPr>
-        <w:numPr>
-          <w:ilvl w:val="0"/>
-          <w:numId w:val="1009"/>
-        </w:numPr>
-        <w:pStyle w:val="Compact"/>
-      </w:pPr>
-      <w:r>
-        <w:rPr>
-          <w:bCs/>
-          <w:b/>
-        </w:rPr>
-        <w:t xml:space="preserve">The new</w:t>
-      </w:r>
-      <w:r>
-        <w:rPr>
-          <w:bCs/>
-          <w:b/>
-        </w:rPr>
-        <w:t xml:space="preserve"> </w:t>
-      </w:r>
-      <w:r>
-        <w:rPr>
-          <w:rStyle w:val="VerbatimChar"/>
-          <w:bCs/>
-          <w:b/>
-        </w:rPr>
-        <w:t xml:space="preserve">amazonAdsActive</w:t>
-      </w:r>
-      <w:r>
-        <w:rPr>
-          <w:bCs/>
-          <w:b/>
-        </w:rPr>
-        <w:t xml:space="preserve"> </w:t>
-      </w:r>
-      <w:r>
-        <w:rPr>
-          <w:bCs/>
-          <w:b/>
-        </w:rPr>
-        <w:t xml:space="preserve">branch in Book Insight has not been exercised live end-to-end.</w:t>
-      </w:r>
-      <w:r>
-        <w:t xml:space="preserve"> </w:t>
-      </w:r>
-      <w:r>
-        <w:t xml:space="preserve">There’s no UI to flip that flag after a book is first added (it’s only set once, via a checkbox at onboarding submit time), and the one real book on the account has it set to false. Verified correct by code inspection and payload tracing only. To see it live: either mark a new book as</w:t>
-      </w:r>
-      <w:r>
-        <w:t xml:space="preserve"> </w:t>
-      </w:r>
-      <w:r>
-        <w:t xml:space="preserve">“</w:t>
-      </w:r>
-      <w:r>
-        <w:t xml:space="preserve">running ads</w:t>
-      </w:r>
-      <w:r>
-        <w:t xml:space="preserve">”</w:t>
-      </w:r>
-      <w:r>
-        <w:t xml:space="preserve"> </w:t>
-      </w:r>
-      <w:r>
-        <w:t xml:space="preserve">at onboarding, or wait for a real customer book that has ads running and refresh its audit.</w:t>
-      </w:r>
-    </w:p>
-    <w:p>
-      <w:pPr>
-        <w:numPr>
-          <w:ilvl w:val="0"/>
-          <w:numId w:val="1009"/>
-        </w:numPr>
-        <w:pStyle w:val="Compact"/>
-      </w:pPr>
-      <w:r>
-        <w:t xml:space="preserve">Only one real book on the account (</w:t>
-      </w:r>
-      <w:r>
-        <w:t xml:space="preserve">“</w:t>
-      </w:r>
-      <w:r>
-        <w:t xml:space="preserve">The Let Them Theory</w:t>
-      </w:r>
-      <w:r>
-        <w:t xml:space="preserve">”</w:t>
-      </w:r>
-      <w:r>
-        <w:t xml:space="preserve">) to test against, limiting what can be verified live at any given time — carried over concern, same root cause as item 9.</w:t>
-      </w:r>
-    </w:p>
-    <w:bookmarkEnd w:id="38"/>
-    <w:bookmarkStart w:id="39" w:name="X8d758077d748e00b2345e0c89dfe58806bb5e82"/>
-    <w:p>
-      <w:pPr>
-        <w:pStyle w:val="Heading3"/>
-      </w:pPr>
-      <w:r>
-        <w:t xml:space="preserve">7.2 A note on this session’s working style, for whoever picks this up</w:t>
+        <w:rPr>
+          <w:bCs/>
+          <w:b/>
+        </w:rPr>
+        <w:t xml:space="preserve">Finance/Ops sign-off — APPROVED.</w:t>
+      </w:r>
+      <w:r>
+        <w:t xml:space="preserve"> </w:t>
+      </w:r>
+      <w:r>
+        <w:t xml:space="preserve">No change in paid-API-call volume per audit from the parallelization; rate limiting intact; one cost-awareness note (longer system prompt, ~3,050 tokens) logged for future reference, not a blocker at current volume.</w:t>
       </w:r>
     </w:p>
     <w:p>
@@ -3610,103 +3393,7 @@
         <w:pStyle w:val="FirstParagraph"/>
       </w:pPr>
       <w:r>
-        <w:t xml:space="preserve">Feedback this session came in heavily via voice dictation and was often terse or garbled (</w:t>
-      </w:r>
-      <w:r>
-        <w:t xml:space="preserve">“</w:t>
-      </w:r>
-      <w:r>
-        <w:t xml:space="preserve">fax and upload</w:t>
-      </w:r>
-      <w:r>
-        <w:t xml:space="preserve">”</w:t>
-      </w:r>
-      <w:r>
-        <w:t xml:space="preserve"> </w:t>
-      </w:r>
-      <w:r>
-        <w:t xml:space="preserve">meant</w:t>
-      </w:r>
-      <w:r>
-        <w:t xml:space="preserve"> </w:t>
-      </w:r>
-      <w:r>
-        <w:t xml:space="preserve">“</w:t>
-      </w:r>
-      <w:r>
-        <w:t xml:space="preserve">fix and upload,</w:t>
-      </w:r>
-      <w:r>
-        <w:t xml:space="preserve">”</w:t>
-      </w:r>
-      <w:r>
-        <w:t xml:space="preserve"> </w:t>
-      </w:r>
-      <w:r>
-        <w:t xml:space="preserve">“</w:t>
-      </w:r>
-      <w:r>
-        <w:t xml:space="preserve">paid outs</w:t>
-      </w:r>
-      <w:r>
-        <w:t xml:space="preserve">”</w:t>
-      </w:r>
-      <w:r>
-        <w:t xml:space="preserve"> </w:t>
-      </w:r>
-      <w:r>
-        <w:t xml:space="preserve">meant</w:t>
-      </w:r>
-      <w:r>
-        <w:t xml:space="preserve"> </w:t>
-      </w:r>
-      <w:r>
-        <w:t xml:space="preserve">“</w:t>
-      </w:r>
-      <w:r>
-        <w:t xml:space="preserve">paid ads</w:t>
-      </w:r>
-      <w:r>
-        <w:t xml:space="preserve">”</w:t>
-      </w:r>
-      <w:r>
-        <w:t xml:space="preserve">). When a customer instruction is ambiguous, the safer read has consistently been the literal, minimal one — don’t over-interpret or add scope that wasn’t explicitly asked for. One earlier misstep this session (renaming</w:t>
-      </w:r>
-      <w:r>
-        <w:t xml:space="preserve"> </w:t>
-      </w:r>
-      <w:r>
-        <w:t xml:space="preserve">“</w:t>
-      </w:r>
-      <w:r>
-        <w:t xml:space="preserve">Best Seller Rank</w:t>
-      </w:r>
-      <w:r>
-        <w:t xml:space="preserve">”</w:t>
-      </w:r>
-      <w:r>
-        <w:t xml:space="preserve"> </w:t>
-      </w:r>
-      <w:r>
-        <w:t xml:space="preserve">to</w:t>
-      </w:r>
-      <w:r>
-        <w:t xml:space="preserve"> </w:t>
-      </w:r>
-      <w:r>
-        <w:t xml:space="preserve">“</w:t>
-      </w:r>
-      <w:r>
-        <w:t xml:space="preserve">Your Category Rank</w:t>
-      </w:r>
-      <w:r>
-        <w:t xml:space="preserve">”</w:t>
-      </w:r>
-      <w:r>
-        <w:t xml:space="preserve"> </w:t>
-      </w:r>
-      <w:r>
-        <w:t xml:space="preserve">without being asked) was corrected sharply and had to be reverted; it’s flagged here as a concrete example of what over-reach looks like on this project, not just abstract advice.</w:t>
+        <w:t xml:space="preserve">None of the three reviews found grounds to withhold sign-off. The two Head of Product follow-ups are real, disclosed, and carried into Section 7.1 and the priority list (Section 8) rather than being fixed unilaterally without John’s direction, consistent with this session’s working style (Section 7.2).</w:t>
       </w:r>
     </w:p>
     <w:p>
@@ -3716,23 +3403,24 @@
         </w:pict>
       </w:r>
     </w:p>
-    <w:bookmarkEnd w:id="39"/>
-    <w:bookmarkEnd w:id="40"/>
-    <w:bookmarkStart w:id="41" w:name="priority-action-list"/>
+    <w:bookmarkEnd w:id="37"/>
+    <w:bookmarkEnd w:id="38"/>
+    <w:bookmarkStart w:id="41" w:name="Xaa4c2cf9281dfcefa6f8925d41dca30e7f73d65"/>
     <w:p>
       <w:pPr>
         <w:pStyle w:val="Heading2"/>
       </w:pPr>
       <w:r>
-        <w:t xml:space="preserve">8. Priority action list</w:t>
-      </w:r>
-    </w:p>
-    <w:p>
-      <w:pPr>
-        <w:pStyle w:val="FirstParagraph"/>
-      </w:pPr>
-      <w:r>
-        <w:t xml:space="preserve">In order:</w:t>
+        <w:t xml:space="preserve">7. Known issues, technical debt, and things worth trusting carefully</w:t>
+      </w:r>
+    </w:p>
+    <w:bookmarkStart w:id="39" w:name="still-open-carried-over-or-new"/>
+    <w:p>
+      <w:pPr>
+        <w:pStyle w:val="Heading3"/>
+      </w:pPr>
+      <w:r>
+        <w:t xml:space="preserve">7.1 Still open, carried over or new</w:t>
       </w:r>
     </w:p>
     <w:p>
@@ -3744,43 +3432,7 @@
         <w:pStyle w:val="Compact"/>
       </w:pPr>
       <w:r>
-        <w:rPr>
-          <w:bCs/>
-          <w:b/>
-        </w:rPr>
-        <w:t xml:space="preserve">Verify the new</w:t>
-      </w:r>
-      <w:r>
-        <w:rPr>
-          <w:bCs/>
-          <w:b/>
-        </w:rPr>
-        <w:t xml:space="preserve"> </w:t>
-      </w:r>
-      <w:r>
-        <w:rPr>
-          <w:rStyle w:val="VerbatimChar"/>
-          <w:bCs/>
-          <w:b/>
-        </w:rPr>
-        <w:t xml:space="preserve">amazonAdsActive</w:t>
-      </w:r>
-      <w:r>
-        <w:rPr>
-          <w:bCs/>
-          <w:b/>
-        </w:rPr>
-        <w:t xml:space="preserve"> </w:t>
-      </w:r>
-      <w:r>
-        <w:rPr>
-          <w:bCs/>
-          <w:b/>
-        </w:rPr>
-        <w:t xml:space="preserve">Book Insight branch live</w:t>
-      </w:r>
-      <w:r>
-        <w:t xml:space="preserve">, once a book exists with that flag set to true (Section 7.1, item 9).</w:t>
+        <w:t xml:space="preserve">Review system (Get Reviews / Build Your ARC) — still a placeholder, per the 12 August handover’s priority list, not started this session.</w:t>
       </w:r>
     </w:p>
     <w:p>
@@ -3792,59 +3444,31 @@
         <w:pStyle w:val="Compact"/>
       </w:pPr>
       <w:r>
-        <w:rPr>
-          <w:bCs/>
-          <w:b/>
-        </w:rPr>
-        <w:t xml:space="preserve">Add a one-line reassurance to the</w:t>
-      </w:r>
-      <w:r>
-        <w:rPr>
-          <w:bCs/>
-          <w:b/>
-        </w:rPr>
-        <w:t xml:space="preserve"> </w:t>
-      </w:r>
-      <w:r>
-        <w:rPr>
-          <w:bCs/>
-          <w:b/>
-        </w:rPr>
-        <w:t xml:space="preserve">“</w:t>
-      </w:r>
-      <w:r>
-        <w:rPr>
-          <w:bCs/>
-          <w:b/>
-        </w:rPr>
-        <w:t xml:space="preserve">Refresh audit</w:t>
-      </w:r>
-      <w:r>
-        <w:rPr>
-          <w:bCs/>
-          <w:b/>
-        </w:rPr>
-        <w:t xml:space="preserve">”</w:t>
-      </w:r>
-      <w:r>
-        <w:rPr>
-          <w:bCs/>
-          <w:b/>
-        </w:rPr>
-        <w:t xml:space="preserve"> </w:t>
-      </w:r>
-      <w:r>
-        <w:rPr>
-          <w:bCs/>
-          <w:b/>
-        </w:rPr>
-        <w:t xml:space="preserve">modal</w:t>
-      </w:r>
-      <w:r>
-        <w:t xml:space="preserve"> </w:t>
-      </w:r>
-      <w:r>
-        <w:t xml:space="preserve">that re-running an audit is free/included (Section 7.1, item 7) — small, low-risk copy fix.</w:t>
+        <w:t xml:space="preserve">Book portfolio feature — still built on</w:t>
+      </w:r>
+      <w:r>
+        <w:t xml:space="preserve"> </w:t>
+      </w:r>
+      <w:r>
+        <w:rPr>
+          <w:rStyle w:val="VerbatimChar"/>
+        </w:rPr>
+        <w:t xml:space="preserve">staging</w:t>
+      </w:r>
+      <w:r>
+        <w:t xml:space="preserve">, not merged to</w:t>
+      </w:r>
+      <w:r>
+        <w:t xml:space="preserve"> </w:t>
+      </w:r>
+      <w:r>
+        <w:rPr>
+          <w:rStyle w:val="VerbatimChar"/>
+        </w:rPr>
+        <w:t xml:space="preserve">main</w:t>
+      </w:r>
+      <w:r>
+        <w:t xml:space="preserve">, not touched this session.</w:t>
       </w:r>
     </w:p>
     <w:p>
@@ -3856,56 +3480,7 @@
         <w:pStyle w:val="Compact"/>
       </w:pPr>
       <w:r>
-        <w:rPr>
-          <w:bCs/>
-          <w:b/>
-        </w:rPr>
-        <w:t xml:space="preserve">Decide whether to extend the</w:t>
-      </w:r>
-      <w:r>
-        <w:rPr>
-          <w:bCs/>
-          <w:b/>
-        </w:rPr>
-        <w:t xml:space="preserve"> </w:t>
-      </w:r>
-      <w:r>
-        <w:rPr>
-          <w:bCs/>
-          <w:b/>
-        </w:rPr>
-        <w:t xml:space="preserve">“</w:t>
-      </w:r>
-      <w:r>
-        <w:rPr>
-          <w:bCs/>
-          <w:b/>
-        </w:rPr>
-        <w:t xml:space="preserve">ACoS</w:t>
-      </w:r>
-      <w:r>
-        <w:rPr>
-          <w:bCs/>
-          <w:b/>
-        </w:rPr>
-        <w:t xml:space="preserve">”</w:t>
-      </w:r>
-      <w:r>
-        <w:rPr>
-          <w:bCs/>
-          <w:b/>
-        </w:rPr>
-        <w:t xml:space="preserve"> </w:t>
-      </w:r>
-      <w:r>
-        <w:rPr>
-          <w:bCs/>
-          <w:b/>
-        </w:rPr>
-        <w:t xml:space="preserve">ban dashboard-wide</w:t>
-      </w:r>
-      <w:r>
-        <w:t xml:space="preserve">, not just to Book Insight (Section 7.1, item 8).</w:t>
+        <w:t xml:space="preserve">No automated tests anywhere in this codebase.</w:t>
       </w:r>
     </w:p>
     <w:p>
@@ -3917,19 +3492,378 @@
         <w:pStyle w:val="Compact"/>
       </w:pPr>
       <w:r>
-        <w:t xml:space="preserve">Everything carried over from the 12 August handover’s priority list that this session didn’t touch: another real live-mode purchase test, live-mode cancellation/payment-failure testing, mobile verification, merging the book portfolio feature to</w:t>
-      </w:r>
-      <w:r>
-        <w:t xml:space="preserve"> </w:t>
-      </w:r>
-      <w:r>
-        <w:rPr>
-          <w:rStyle w:val="VerbatimChar"/>
-        </w:rPr>
-        <w:t xml:space="preserve">main</w:t>
-      </w:r>
-      <w:r>
-        <w:t xml:space="preserve">, and starting the review system build. Re-confirm current status of each at the start of the next session rather than assuming the 12 August state still holds.</w:t>
+        <w:t xml:space="preserve">Mobile still not re-verified for anything, carried over from 12 August.</w:t>
+      </w:r>
+    </w:p>
+    <w:p>
+      <w:pPr>
+        <w:numPr>
+          <w:ilvl w:val="0"/>
+          <w:numId w:val="1010"/>
+        </w:numPr>
+        <w:pStyle w:val="Compact"/>
+      </w:pPr>
+      <w:r>
+        <w:t xml:space="preserve">No</w:t>
+      </w:r>
+      <w:r>
+        <w:t xml:space="preserve"> </w:t>
+      </w:r>
+      <w:r>
+        <w:rPr>
+          <w:rStyle w:val="VerbatimChar"/>
+        </w:rPr>
+        <w:t xml:space="preserve">git</w:t>
+      </w:r>
+      <w:r>
+        <w:t xml:space="preserve"> </w:t>
+      </w:r>
+      <w:r>
+        <w:t xml:space="preserve">CLI access this session (see Section 3.2) — re-verify at the start of the next session rather than assuming either way.</w:t>
+      </w:r>
+    </w:p>
+    <w:p>
+      <w:pPr>
+        <w:numPr>
+          <w:ilvl w:val="0"/>
+          <w:numId w:val="1010"/>
+        </w:numPr>
+        <w:pStyle w:val="Compact"/>
+      </w:pPr>
+      <w:r>
+        <w:rPr>
+          <w:rStyle w:val="VerbatimChar"/>
+        </w:rPr>
+        <w:t xml:space="preserve">raw.githubusercontent.com</w:t>
+      </w:r>
+      <w:r>
+        <w:t xml:space="preserve">’s ~5-minute CDN cache can make a fresh push look stale if fetched immediately — verify via GitHub’s commit UI instead.</w:t>
+      </w:r>
+    </w:p>
+    <w:p>
+      <w:pPr>
+        <w:numPr>
+          <w:ilvl w:val="0"/>
+          <w:numId w:val="1010"/>
+        </w:numPr>
+        <w:pStyle w:val="Compact"/>
+      </w:pPr>
+      <w:r>
+        <w:rPr>
+          <w:bCs/>
+          <w:b/>
+        </w:rPr>
+        <w:t xml:space="preserve">New, from this session’s review pass:</w:t>
+      </w:r>
+      <w:r>
+        <w:t xml:space="preserve"> </w:t>
+      </w:r>
+      <w:r>
+        <w:t xml:space="preserve">the</w:t>
+      </w:r>
+      <w:r>
+        <w:t xml:space="preserve"> </w:t>
+      </w:r>
+      <w:r>
+        <w:t xml:space="preserve">“</w:t>
+      </w:r>
+      <w:r>
+        <w:t xml:space="preserve">Refresh audit</w:t>
+      </w:r>
+      <w:r>
+        <w:t xml:space="preserve">”</w:t>
+      </w:r>
+      <w:r>
+        <w:t xml:space="preserve"> </w:t>
+      </w:r>
+      <w:r>
+        <w:t xml:space="preserve">modal never actually tells the author refreshing is free — it shows a cooldown and a timestamp, but no reassuring copy. The customer’s original worry (</w:t>
+      </w:r>
+      <w:r>
+        <w:t xml:space="preserve">“</w:t>
+      </w:r>
+      <w:r>
+        <w:t xml:space="preserve">does this cost anything?</w:t>
+      </w:r>
+      <w:r>
+        <w:t xml:space="preserve">”</w:t>
+      </w:r>
+      <w:r>
+        <w:t xml:space="preserve">) is only partially addressed. A one-line copy addition would close this.</w:t>
+      </w:r>
+    </w:p>
+    <w:p>
+      <w:pPr>
+        <w:numPr>
+          <w:ilvl w:val="0"/>
+          <w:numId w:val="1010"/>
+        </w:numPr>
+        <w:pStyle w:val="Compact"/>
+      </w:pPr>
+      <w:r>
+        <w:rPr>
+          <w:bCs/>
+          <w:b/>
+        </w:rPr>
+        <w:t xml:space="preserve">New, from this session’s review pass:</w:t>
+      </w:r>
+      <w:r>
+        <w:t xml:space="preserve"> </w:t>
+      </w:r>
+      <w:r>
+        <w:t xml:space="preserve">the</w:t>
+      </w:r>
+      <w:r>
+        <w:t xml:space="preserve"> </w:t>
+      </w:r>
+      <w:r>
+        <w:t xml:space="preserve">“</w:t>
+      </w:r>
+      <w:r>
+        <w:t xml:space="preserve">ACoS</w:t>
+      </w:r>
+      <w:r>
+        <w:t xml:space="preserve">”</w:t>
+      </w:r>
+      <w:r>
+        <w:t xml:space="preserve"> </w:t>
+      </w:r>
+      <w:r>
+        <w:t xml:space="preserve">jargon ban only applies to the Book Insight paragraph. The same term (</w:t>
+      </w:r>
+      <w:r>
+        <w:t xml:space="preserve">“</w:t>
+      </w:r>
+      <w:r>
+        <w:t xml:space="preserve">target ACoS ceiling</w:t>
+      </w:r>
+      <w:r>
+        <w:t xml:space="preserve">”</w:t>
+      </w:r>
+      <w:r>
+        <w:t xml:space="preserve">) still appears in the</w:t>
+      </w:r>
+      <w:r>
+        <w:t xml:space="preserve"> </w:t>
+      </w:r>
+      <w:r>
+        <w:rPr>
+          <w:rStyle w:val="VerbatimChar"/>
+        </w:rPr>
+        <w:t xml:space="preserve">strategySteps</w:t>
+      </w:r>
+      <w:r>
+        <w:t xml:space="preserve"> </w:t>
+      </w:r>
+      <w:r>
+        <w:t xml:space="preserve">prompt instructions (Marketing Strategy tab), so the same non-technical author can still hit this jargon elsewhere on the dashboard. Worth deciding whether to extend the ban dashboard-wide.</w:t>
+      </w:r>
+    </w:p>
+    <w:p>
+      <w:pPr>
+        <w:numPr>
+          <w:ilvl w:val="0"/>
+          <w:numId w:val="1010"/>
+        </w:numPr>
+        <w:pStyle w:val="Compact"/>
+      </w:pPr>
+      <w:r>
+        <w:rPr>
+          <w:bCs/>
+          <w:b/>
+        </w:rPr>
+        <w:t xml:space="preserve">The new</w:t>
+      </w:r>
+      <w:r>
+        <w:rPr>
+          <w:bCs/>
+          <w:b/>
+        </w:rPr>
+        <w:t xml:space="preserve"> </w:t>
+      </w:r>
+      <w:r>
+        <w:rPr>
+          <w:rStyle w:val="VerbatimChar"/>
+          <w:bCs/>
+          <w:b/>
+        </w:rPr>
+        <w:t xml:space="preserve">amazonAdsActive</w:t>
+      </w:r>
+      <w:r>
+        <w:rPr>
+          <w:bCs/>
+          <w:b/>
+        </w:rPr>
+        <w:t xml:space="preserve"> </w:t>
+      </w:r>
+      <w:r>
+        <w:rPr>
+          <w:bCs/>
+          <w:b/>
+        </w:rPr>
+        <w:t xml:space="preserve">branch in Book Insight has not been exercised live end-to-end.</w:t>
+      </w:r>
+      <w:r>
+        <w:t xml:space="preserve"> </w:t>
+      </w:r>
+      <w:r>
+        <w:t xml:space="preserve">There’s no UI to flip that flag after a book is first added (it’s only set once, via a checkbox at onboarding submit time), and the one real book on the account has it set to false. Verified correct by code inspection and payload tracing only. To see it live: either mark a new book as</w:t>
+      </w:r>
+      <w:r>
+        <w:t xml:space="preserve"> </w:t>
+      </w:r>
+      <w:r>
+        <w:t xml:space="preserve">“</w:t>
+      </w:r>
+      <w:r>
+        <w:t xml:space="preserve">running ads</w:t>
+      </w:r>
+      <w:r>
+        <w:t xml:space="preserve">”</w:t>
+      </w:r>
+      <w:r>
+        <w:t xml:space="preserve"> </w:t>
+      </w:r>
+      <w:r>
+        <w:t xml:space="preserve">at onboarding, or wait for a real customer book that has ads running and refresh its audit.</w:t>
+      </w:r>
+    </w:p>
+    <w:p>
+      <w:pPr>
+        <w:numPr>
+          <w:ilvl w:val="0"/>
+          <w:numId w:val="1010"/>
+        </w:numPr>
+        <w:pStyle w:val="Compact"/>
+      </w:pPr>
+      <w:r>
+        <w:t xml:space="preserve">Only one real book on the account (</w:t>
+      </w:r>
+      <w:r>
+        <w:t xml:space="preserve">“</w:t>
+      </w:r>
+      <w:r>
+        <w:t xml:space="preserve">The Let Them Theory</w:t>
+      </w:r>
+      <w:r>
+        <w:t xml:space="preserve">”</w:t>
+      </w:r>
+      <w:r>
+        <w:t xml:space="preserve">) to test against, limiting what can be verified live at any given time — carried over concern, same root cause as item 9.</w:t>
+      </w:r>
+    </w:p>
+    <w:bookmarkEnd w:id="39"/>
+    <w:bookmarkStart w:id="40" w:name="X8d758077d748e00b2345e0c89dfe58806bb5e82"/>
+    <w:p>
+      <w:pPr>
+        <w:pStyle w:val="Heading3"/>
+      </w:pPr>
+      <w:r>
+        <w:t xml:space="preserve">7.2 A note on this session’s working style, for whoever picks this up</w:t>
+      </w:r>
+    </w:p>
+    <w:p>
+      <w:pPr>
+        <w:pStyle w:val="FirstParagraph"/>
+      </w:pPr>
+      <w:r>
+        <w:t xml:space="preserve">Feedback this session came in heavily via voice dictation and was often terse or garbled (</w:t>
+      </w:r>
+      <w:r>
+        <w:t xml:space="preserve">“</w:t>
+      </w:r>
+      <w:r>
+        <w:t xml:space="preserve">fax and upload</w:t>
+      </w:r>
+      <w:r>
+        <w:t xml:space="preserve">”</w:t>
+      </w:r>
+      <w:r>
+        <w:t xml:space="preserve"> </w:t>
+      </w:r>
+      <w:r>
+        <w:t xml:space="preserve">meant</w:t>
+      </w:r>
+      <w:r>
+        <w:t xml:space="preserve"> </w:t>
+      </w:r>
+      <w:r>
+        <w:t xml:space="preserve">“</w:t>
+      </w:r>
+      <w:r>
+        <w:t xml:space="preserve">fix and upload,</w:t>
+      </w:r>
+      <w:r>
+        <w:t xml:space="preserve">”</w:t>
+      </w:r>
+      <w:r>
+        <w:t xml:space="preserve"> </w:t>
+      </w:r>
+      <w:r>
+        <w:t xml:space="preserve">“</w:t>
+      </w:r>
+      <w:r>
+        <w:t xml:space="preserve">paid outs</w:t>
+      </w:r>
+      <w:r>
+        <w:t xml:space="preserve">”</w:t>
+      </w:r>
+      <w:r>
+        <w:t xml:space="preserve"> </w:t>
+      </w:r>
+      <w:r>
+        <w:t xml:space="preserve">meant</w:t>
+      </w:r>
+      <w:r>
+        <w:t xml:space="preserve"> </w:t>
+      </w:r>
+      <w:r>
+        <w:t xml:space="preserve">“</w:t>
+      </w:r>
+      <w:r>
+        <w:t xml:space="preserve">paid ads</w:t>
+      </w:r>
+      <w:r>
+        <w:t xml:space="preserve">”</w:t>
+      </w:r>
+      <w:r>
+        <w:t xml:space="preserve">). When a customer instruction is ambiguous, the safer read has consistently been the literal, minimal one — don’t over-interpret or add scope that wasn’t explicitly asked for. One earlier misstep this session (renaming</w:t>
+      </w:r>
+      <w:r>
+        <w:t xml:space="preserve"> </w:t>
+      </w:r>
+      <w:r>
+        <w:t xml:space="preserve">“</w:t>
+      </w:r>
+      <w:r>
+        <w:t xml:space="preserve">Best Seller Rank</w:t>
+      </w:r>
+      <w:r>
+        <w:t xml:space="preserve">”</w:t>
+      </w:r>
+      <w:r>
+        <w:t xml:space="preserve"> </w:t>
+      </w:r>
+      <w:r>
+        <w:t xml:space="preserve">to</w:t>
+      </w:r>
+      <w:r>
+        <w:t xml:space="preserve"> </w:t>
+      </w:r>
+      <w:r>
+        <w:t xml:space="preserve">“</w:t>
+      </w:r>
+      <w:r>
+        <w:t xml:space="preserve">Your Category Rank</w:t>
+      </w:r>
+      <w:r>
+        <w:t xml:space="preserve">”</w:t>
+      </w:r>
+      <w:r>
+        <w:t xml:space="preserve"> </w:t>
+      </w:r>
+      <w:r>
+        <w:t xml:space="preserve">without being asked) was corrected sharply and had to be reverted; it’s flagged here as a concrete example of what over-reach looks like on this project, not just abstract advice.</w:t>
       </w:r>
     </w:p>
     <w:p>
@@ -3939,23 +3873,23 @@
         </w:pict>
       </w:r>
     </w:p>
+    <w:bookmarkEnd w:id="40"/>
     <w:bookmarkEnd w:id="41"/>
-    <w:bookmarkStart w:id="45" w:name="appendix"/>
+    <w:bookmarkStart w:id="42" w:name="priority-action-list"/>
     <w:p>
       <w:pPr>
         <w:pStyle w:val="Heading2"/>
       </w:pPr>
       <w:r>
-        <w:t xml:space="preserve">9. Appendix</w:t>
-      </w:r>
-    </w:p>
-    <w:bookmarkStart w:id="42" w:name="X909db41676850843e7009c09a358f6b39d6b338"/>
-    <w:p>
-      <w:pPr>
-        <w:pStyle w:val="Heading3"/>
-      </w:pPr>
-      <w:r>
-        <w:t xml:space="preserve">9.1 Credentials checklist (obtain via the account owner, never via chat) — unchanged</w:t>
+        <w:t xml:space="preserve">8. Priority action list</w:t>
+      </w:r>
+    </w:p>
+    <w:p>
+      <w:pPr>
+        <w:pStyle w:val="FirstParagraph"/>
+      </w:pPr>
+      <w:r>
+        <w:t xml:space="preserve">In order:</w:t>
       </w:r>
     </w:p>
     <w:p>
@@ -3967,16 +3901,43 @@
         <w:pStyle w:val="Compact"/>
       </w:pPr>
       <w:r>
-        <w:t xml:space="preserve">Stripe: Vybologybooks account (</w:t>
-      </w:r>
-      <w:r>
-        <w:rPr>
-          <w:rStyle w:val="VerbatimChar"/>
-        </w:rPr>
-        <w:t xml:space="preserve">acct_1Rfp4sBqkDn8JXbQ</w:t>
-      </w:r>
-      <w:r>
-        <w:t xml:space="preserve">)</w:t>
+        <w:rPr>
+          <w:bCs/>
+          <w:b/>
+        </w:rPr>
+        <w:t xml:space="preserve">Verify the new</w:t>
+      </w:r>
+      <w:r>
+        <w:rPr>
+          <w:bCs/>
+          <w:b/>
+        </w:rPr>
+        <w:t xml:space="preserve"> </w:t>
+      </w:r>
+      <w:r>
+        <w:rPr>
+          <w:rStyle w:val="VerbatimChar"/>
+          <w:bCs/>
+          <w:b/>
+        </w:rPr>
+        <w:t xml:space="preserve">amazonAdsActive</w:t>
+      </w:r>
+      <w:r>
+        <w:rPr>
+          <w:bCs/>
+          <w:b/>
+        </w:rPr>
+        <w:t xml:space="preserve"> </w:t>
+      </w:r>
+      <w:r>
+        <w:rPr>
+          <w:bCs/>
+          <w:b/>
+        </w:rPr>
+        <w:t xml:space="preserve">Book Insight branch live</w:t>
+      </w:r>
+      <w:r>
+        <w:t xml:space="preserve">, once a book exists with that flag set to true (Section 7.1, item 9).</w:t>
       </w:r>
     </w:p>
     <w:p>
@@ -3988,22 +3949,59 @@
         <w:pStyle w:val="Compact"/>
       </w:pPr>
       <w:r>
-        <w:t xml:space="preserve">Vercel:</w:t>
-      </w:r>
-      <w:r>
-        <w:t xml:space="preserve"> </w:t>
-      </w:r>
-      <w:r>
-        <w:rPr>
-          <w:rStyle w:val="VerbatimChar"/>
-        </w:rPr>
-        <w:t xml:space="preserve">product-28/readerbull</w:t>
-      </w:r>
-      <w:r>
-        <w:t xml:space="preserve"> </w:t>
-      </w:r>
-      <w:r>
-        <w:t xml:space="preserve">project access</w:t>
+        <w:rPr>
+          <w:bCs/>
+          <w:b/>
+        </w:rPr>
+        <w:t xml:space="preserve">Add a one-line reassurance to the</w:t>
+      </w:r>
+      <w:r>
+        <w:rPr>
+          <w:bCs/>
+          <w:b/>
+        </w:rPr>
+        <w:t xml:space="preserve"> </w:t>
+      </w:r>
+      <w:r>
+        <w:rPr>
+          <w:bCs/>
+          <w:b/>
+        </w:rPr>
+        <w:t xml:space="preserve">“</w:t>
+      </w:r>
+      <w:r>
+        <w:rPr>
+          <w:bCs/>
+          <w:b/>
+        </w:rPr>
+        <w:t xml:space="preserve">Refresh audit</w:t>
+      </w:r>
+      <w:r>
+        <w:rPr>
+          <w:bCs/>
+          <w:b/>
+        </w:rPr>
+        <w:t xml:space="preserve">”</w:t>
+      </w:r>
+      <w:r>
+        <w:rPr>
+          <w:bCs/>
+          <w:b/>
+        </w:rPr>
+        <w:t xml:space="preserve"> </w:t>
+      </w:r>
+      <w:r>
+        <w:rPr>
+          <w:bCs/>
+          <w:b/>
+        </w:rPr>
+        <w:t xml:space="preserve">modal</w:t>
+      </w:r>
+      <w:r>
+        <w:t xml:space="preserve"> </w:t>
+      </w:r>
+      <w:r>
+        <w:t xml:space="preserve">that re-running an audit is free/included (Section 7.1, item 7) — small, low-risk copy fix.</w:t>
       </w:r>
     </w:p>
     <w:p>
@@ -4015,34 +4013,56 @@
         <w:pStyle w:val="Compact"/>
       </w:pPr>
       <w:r>
-        <w:t xml:space="preserve">Supabase:</w:t>
-      </w:r>
-      <w:r>
-        <w:t xml:space="preserve"> </w:t>
-      </w:r>
-      <w:r>
+        <w:rPr>
+          <w:bCs/>
+          <w:b/>
+        </w:rPr>
+        <w:t xml:space="preserve">Decide whether to extend the</w:t>
+      </w:r>
+      <w:r>
+        <w:rPr>
+          <w:bCs/>
+          <w:b/>
+        </w:rPr>
+        <w:t xml:space="preserve"> </w:t>
+      </w:r>
+      <w:r>
+        <w:rPr>
+          <w:bCs/>
+          <w:b/>
+        </w:rPr>
         <w:t xml:space="preserve">“</w:t>
       </w:r>
       <w:r>
-        <w:t xml:space="preserve">Readerbull</w:t>
-      </w:r>
-      <w:r>
+        <w:rPr>
+          <w:bCs/>
+          <w:b/>
+        </w:rPr>
+        <w:t xml:space="preserve">ACoS</w:t>
+      </w:r>
+      <w:r>
+        <w:rPr>
+          <w:bCs/>
+          <w:b/>
+        </w:rPr>
         <w:t xml:space="preserve">”</w:t>
       </w:r>
       <w:r>
-        <w:t xml:space="preserve"> </w:t>
-      </w:r>
-      <w:r>
-        <w:t xml:space="preserve">project,</w:t>
-      </w:r>
-      <w:r>
-        <w:t xml:space="preserve"> </w:t>
-      </w:r>
-      <w:r>
-        <w:rPr>
-          <w:rStyle w:val="VerbatimChar"/>
-        </w:rPr>
-        <w:t xml:space="preserve">tqkeqjisqqvxasyzrfax</w:t>
+        <w:rPr>
+          <w:bCs/>
+          <w:b/>
+        </w:rPr>
+        <w:t xml:space="preserve"> </w:t>
+      </w:r>
+      <w:r>
+        <w:rPr>
+          <w:bCs/>
+          <w:b/>
+        </w:rPr>
+        <w:t xml:space="preserve">ban dashboard-wide</w:t>
+      </w:r>
+      <w:r>
+        <w:t xml:space="preserve">, not just to Book Insight (Section 7.1, item 8).</w:t>
       </w:r>
     </w:p>
     <w:p>
@@ -4054,54 +4074,45 @@
         <w:pStyle w:val="Compact"/>
       </w:pPr>
       <w:r>
-        <w:t xml:space="preserve">GitHub:</w:t>
-      </w:r>
-      <w:r>
-        <w:t xml:space="preserve"> </w:t>
-      </w:r>
-      <w:r>
-        <w:rPr>
-          <w:rStyle w:val="VerbatimChar"/>
-        </w:rPr>
-        <w:t xml:space="preserve">johnhones/readerbull</w:t>
-      </w:r>
-      <w:r>
-        <w:t xml:space="preserve"> </w:t>
-      </w:r>
-      <w:r>
-        <w:t xml:space="preserve">repo access —</w:t>
-      </w:r>
-      <w:r>
-        <w:t xml:space="preserve"> </w:t>
-      </w:r>
-      <w:r>
-        <w:rPr>
-          <w:bCs/>
-          <w:b/>
-        </w:rPr>
-        <w:t xml:space="preserve">do not assume CLI git access; verify at session start (Section 3.2)</w:t>
-      </w:r>
-    </w:p>
-    <w:p>
-      <w:pPr>
-        <w:numPr>
-          <w:ilvl w:val="0"/>
-          <w:numId w:val="1011"/>
-        </w:numPr>
-        <w:pStyle w:val="Compact"/>
-      </w:pPr>
-      <w:r>
-        <w:t xml:space="preserve">Resend, Anthropic, SerpApi, DataForSEO: as before</w:t>
+        <w:t xml:space="preserve">Everything carried over from the 12 August handover’s priority list that this session didn’t touch: another real live-mode purchase test, live-mode cancellation/payment-failure testing, mobile verification, merging the book portfolio feature to</w:t>
+      </w:r>
+      <w:r>
+        <w:t xml:space="preserve"> </w:t>
+      </w:r>
+      <w:r>
+        <w:rPr>
+          <w:rStyle w:val="VerbatimChar"/>
+        </w:rPr>
+        <w:t xml:space="preserve">main</w:t>
+      </w:r>
+      <w:r>
+        <w:t xml:space="preserve">, and starting the review system build. Re-confirm current status of each at the start of the next session rather than assuming the 12 August state still holds.</w:t>
+      </w:r>
+    </w:p>
+    <w:p>
+      <w:r>
+        <w:pict>
+          <v:rect style="width:0;height:1.5pt" o:hralign="center" o:hrstd="t" o:hr="t"/>
+        </w:pict>
       </w:r>
     </w:p>
     <w:bookmarkEnd w:id="42"/>
-    <w:bookmarkStart w:id="43" w:name="Xdb8a469738834941b784b065a297bb0b71ecea3"/>
+    <w:bookmarkStart w:id="46" w:name="appendix"/>
+    <w:p>
+      <w:pPr>
+        <w:pStyle w:val="Heading2"/>
+      </w:pPr>
+      <w:r>
+        <w:t xml:space="preserve">9. Appendix</w:t>
+      </w:r>
+    </w:p>
+    <w:bookmarkStart w:id="43" w:name="X909db41676850843e7009c09a358f6b39d6b338"/>
     <w:p>
       <w:pPr>
         <w:pStyle w:val="Heading3"/>
       </w:pPr>
       <w:r>
-        <w:t xml:space="preserve">9.2 Prior handover documents, and how to weigh them</w:t>
+        <w:t xml:space="preserve">9.1 Credentials checklist (obtain via the account owner, never via chat) — unchanged</w:t>
       </w:r>
     </w:p>
     <w:p>
@@ -4113,6 +4124,152 @@
         <w:pStyle w:val="Compact"/>
       </w:pPr>
       <w:r>
+        <w:t xml:space="preserve">Stripe: Vybologybooks account (</w:t>
+      </w:r>
+      <w:r>
+        <w:rPr>
+          <w:rStyle w:val="VerbatimChar"/>
+        </w:rPr>
+        <w:t xml:space="preserve">acct_1Rfp4sBqkDn8JXbQ</w:t>
+      </w:r>
+      <w:r>
+        <w:t xml:space="preserve">)</w:t>
+      </w:r>
+    </w:p>
+    <w:p>
+      <w:pPr>
+        <w:numPr>
+          <w:ilvl w:val="0"/>
+          <w:numId w:val="1012"/>
+        </w:numPr>
+        <w:pStyle w:val="Compact"/>
+      </w:pPr>
+      <w:r>
+        <w:t xml:space="preserve">Vercel:</w:t>
+      </w:r>
+      <w:r>
+        <w:t xml:space="preserve"> </w:t>
+      </w:r>
+      <w:r>
+        <w:rPr>
+          <w:rStyle w:val="VerbatimChar"/>
+        </w:rPr>
+        <w:t xml:space="preserve">product-28/readerbull</w:t>
+      </w:r>
+      <w:r>
+        <w:t xml:space="preserve"> </w:t>
+      </w:r>
+      <w:r>
+        <w:t xml:space="preserve">project access</w:t>
+      </w:r>
+    </w:p>
+    <w:p>
+      <w:pPr>
+        <w:numPr>
+          <w:ilvl w:val="0"/>
+          <w:numId w:val="1012"/>
+        </w:numPr>
+        <w:pStyle w:val="Compact"/>
+      </w:pPr>
+      <w:r>
+        <w:t xml:space="preserve">Supabase:</w:t>
+      </w:r>
+      <w:r>
+        <w:t xml:space="preserve"> </w:t>
+      </w:r>
+      <w:r>
+        <w:t xml:space="preserve">“</w:t>
+      </w:r>
+      <w:r>
+        <w:t xml:space="preserve">Readerbull</w:t>
+      </w:r>
+      <w:r>
+        <w:t xml:space="preserve">”</w:t>
+      </w:r>
+      <w:r>
+        <w:t xml:space="preserve"> </w:t>
+      </w:r>
+      <w:r>
+        <w:t xml:space="preserve">project,</w:t>
+      </w:r>
+      <w:r>
+        <w:t xml:space="preserve"> </w:t>
+      </w:r>
+      <w:r>
+        <w:rPr>
+          <w:rStyle w:val="VerbatimChar"/>
+        </w:rPr>
+        <w:t xml:space="preserve">tqkeqjisqqvxasyzrfax</w:t>
+      </w:r>
+    </w:p>
+    <w:p>
+      <w:pPr>
+        <w:numPr>
+          <w:ilvl w:val="0"/>
+          <w:numId w:val="1012"/>
+        </w:numPr>
+        <w:pStyle w:val="Compact"/>
+      </w:pPr>
+      <w:r>
+        <w:t xml:space="preserve">GitHub:</w:t>
+      </w:r>
+      <w:r>
+        <w:t xml:space="preserve"> </w:t>
+      </w:r>
+      <w:r>
+        <w:rPr>
+          <w:rStyle w:val="VerbatimChar"/>
+        </w:rPr>
+        <w:t xml:space="preserve">johnhones/readerbull</w:t>
+      </w:r>
+      <w:r>
+        <w:t xml:space="preserve"> </w:t>
+      </w:r>
+      <w:r>
+        <w:t xml:space="preserve">repo access —</w:t>
+      </w:r>
+      <w:r>
+        <w:t xml:space="preserve"> </w:t>
+      </w:r>
+      <w:r>
+        <w:rPr>
+          <w:bCs/>
+          <w:b/>
+        </w:rPr>
+        <w:t xml:space="preserve">do not assume CLI git access; verify at session start (Section 3.2)</w:t>
+      </w:r>
+    </w:p>
+    <w:p>
+      <w:pPr>
+        <w:numPr>
+          <w:ilvl w:val="0"/>
+          <w:numId w:val="1012"/>
+        </w:numPr>
+        <w:pStyle w:val="Compact"/>
+      </w:pPr>
+      <w:r>
+        <w:t xml:space="preserve">Resend, Anthropic, SerpApi, DataForSEO: as before</w:t>
+      </w:r>
+    </w:p>
+    <w:bookmarkEnd w:id="43"/>
+    <w:bookmarkStart w:id="44" w:name="Xdb8a469738834941b784b065a297bb0b71ecea3"/>
+    <w:p>
+      <w:pPr>
+        <w:pStyle w:val="Heading3"/>
+      </w:pPr>
+      <w:r>
+        <w:t xml:space="preserve">9.2 Prior handover documents, and how to weigh them</w:t>
+      </w:r>
+    </w:p>
+    <w:p>
+      <w:pPr>
+        <w:numPr>
+          <w:ilvl w:val="0"/>
+          <w:numId w:val="1013"/>
+        </w:numPr>
+        <w:pStyle w:val="Compact"/>
+      </w:pPr>
+      <w:r>
         <w:rPr>
           <w:rStyle w:val="VerbatimChar"/>
         </w:rPr>
@@ -4141,8 +4298,8 @@
         <w:t xml:space="preserve">— trust the live system over any written document, including this one, when they disagree.</w:t>
       </w:r>
     </w:p>
-    <w:bookmarkEnd w:id="43"/>
-    <w:bookmarkStart w:id="44" w:name="who-to-ask"/>
+    <w:bookmarkEnd w:id="44"/>
+    <w:bookmarkStart w:id="45" w:name="who-to-ask"/>
     <w:p>
       <w:pPr>
         <w:pStyle w:val="Heading3"/>
@@ -4166,9 +4323,9 @@
         </w:pict>
       </w:r>
     </w:p>
-    <w:bookmarkEnd w:id="44"/>
     <w:bookmarkEnd w:id="45"/>
     <w:bookmarkEnd w:id="46"/>
+    <w:bookmarkEnd w:id="47"/>
     <w:sectPr/>
   </w:body>
 </w:document>
@@ -4518,34 +4675,7 @@
     <w:abstractNumId w:val="991"/>
   </w:num>
   <w:num w:numId="1009">
-    <w:abstractNumId w:val="99411"/>
-    <w:lvlOverride w:ilvl="0">
-      <w:startOverride w:val="1"/>
-    </w:lvlOverride>
-    <w:lvlOverride w:ilvl="1">
-      <w:startOverride w:val="1"/>
-    </w:lvlOverride>
-    <w:lvlOverride w:ilvl="2">
-      <w:startOverride w:val="1"/>
-    </w:lvlOverride>
-    <w:lvlOverride w:ilvl="3">
-      <w:startOverride w:val="1"/>
-    </w:lvlOverride>
-    <w:lvlOverride w:ilvl="4">
-      <w:startOverride w:val="1"/>
-    </w:lvlOverride>
-    <w:lvlOverride w:ilvl="5">
-      <w:startOverride w:val="1"/>
-    </w:lvlOverride>
-    <w:lvlOverride w:ilvl="6">
-      <w:startOverride w:val="1"/>
-    </w:lvlOverride>
-    <w:lvlOverride w:ilvl="7">
-      <w:startOverride w:val="1"/>
-    </w:lvlOverride>
-    <w:lvlOverride w:ilvl="8">
-      <w:startOverride w:val="1"/>
-    </w:lvlOverride>
+    <w:abstractNumId w:val="991"/>
   </w:num>
   <w:num w:numId="1010">
     <w:abstractNumId w:val="99411"/>
@@ -4578,9 +4708,39 @@
     </w:lvlOverride>
   </w:num>
   <w:num w:numId="1011">
+    <w:abstractNumId w:val="99411"/>
+    <w:lvlOverride w:ilvl="0">
+      <w:startOverride w:val="1"/>
+    </w:lvlOverride>
+    <w:lvlOverride w:ilvl="1">
+      <w:startOverride w:val="1"/>
+    </w:lvlOverride>
+    <w:lvlOverride w:ilvl="2">
+      <w:startOverride w:val="1"/>
+    </w:lvlOverride>
+    <w:lvlOverride w:ilvl="3">
+      <w:startOverride w:val="1"/>
+    </w:lvlOverride>
+    <w:lvlOverride w:ilvl="4">
+      <w:startOverride w:val="1"/>
+    </w:lvlOverride>
+    <w:lvlOverride w:ilvl="5">
+      <w:startOverride w:val="1"/>
+    </w:lvlOverride>
+    <w:lvlOverride w:ilvl="6">
+      <w:startOverride w:val="1"/>
+    </w:lvlOverride>
+    <w:lvlOverride w:ilvl="7">
+      <w:startOverride w:val="1"/>
+    </w:lvlOverride>
+    <w:lvlOverride w:ilvl="8">
+      <w:startOverride w:val="1"/>
+    </w:lvlOverride>
+  </w:num>
+  <w:num w:numId="1012">
     <w:abstractNumId w:val="991"/>
   </w:num>
-  <w:num w:numId="1012">
+  <w:num w:numId="1013">
     <w:abstractNumId w:val="991"/>
   </w:num>
 </w:numbering>

</xml_diff>